<commit_message>
docs & modules: update SIEM/SOAR components, documentation, attack simulator and VKR files
</commit_message>
<xml_diff>
--- a/VKR/Титульник.docx
+++ b/VKR/Титульник.docx
@@ -109,6 +109,15 @@
                 <w:szCs w:val="28"/>
                 <w:lang w:val="ru-RU" w:eastAsia="ru-RU"/>
               </w:rPr>
+              <w:t>-</w:t>
+            </w:r>
+            <w:r>
+              <w:rPr>
+                <w:rFonts w:ascii="Times New Roman" w:hAnsi="Times New Roman" w:cs="Times New Roman"/>
+                <w:sz w:val="28"/>
+                <w:szCs w:val="28"/>
+                <w:lang w:val="ru-RU" w:eastAsia="ru-RU"/>
+              </w:rPr>
               <w:t>412</w:t>
             </w:r>
           </w:p>
@@ -135,7 +144,6 @@
                 <w:lang w:eastAsia="ru-RU"/>
               </w:rPr>
             </w:pPr>
-            <w:proofErr w:type="spellStart"/>
             <w:r>
               <w:rPr>
                 <w:rFonts w:ascii="Times New Roman" w:hAnsi="Times New Roman" w:cs="Times New Roman"/>
@@ -144,77 +152,8 @@
                 <w:vertAlign w:val="superscript"/>
                 <w:lang w:eastAsia="ru-RU"/>
               </w:rPr>
-              <w:t>индекс</w:t>
-            </w:r>
-            <w:proofErr w:type="spellEnd"/>
-            <w:r>
-              <w:rPr>
-                <w:rFonts w:ascii="Times New Roman" w:hAnsi="Times New Roman" w:cs="Times New Roman"/>
-                <w:sz w:val="28"/>
-                <w:szCs w:val="28"/>
-                <w:vertAlign w:val="superscript"/>
-                <w:lang w:eastAsia="ru-RU"/>
-              </w:rPr>
-              <w:t xml:space="preserve"> и </w:t>
-            </w:r>
-            <w:proofErr w:type="spellStart"/>
-            <w:r>
-              <w:rPr>
-                <w:rFonts w:ascii="Times New Roman" w:hAnsi="Times New Roman" w:cs="Times New Roman"/>
-                <w:sz w:val="28"/>
-                <w:szCs w:val="28"/>
-                <w:vertAlign w:val="superscript"/>
-                <w:lang w:eastAsia="ru-RU"/>
-              </w:rPr>
-              <w:t>наименование</w:t>
-            </w:r>
-            <w:proofErr w:type="spellEnd"/>
-            <w:r>
-              <w:rPr>
-                <w:rFonts w:ascii="Times New Roman" w:hAnsi="Times New Roman" w:cs="Times New Roman"/>
-                <w:sz w:val="28"/>
-                <w:szCs w:val="28"/>
-                <w:vertAlign w:val="superscript"/>
-                <w:lang w:eastAsia="ru-RU"/>
-              </w:rPr>
-              <w:t xml:space="preserve"> </w:t>
-            </w:r>
-            <w:proofErr w:type="spellStart"/>
-            <w:proofErr w:type="gramStart"/>
-            <w:r>
-              <w:rPr>
-                <w:rFonts w:ascii="Times New Roman" w:hAnsi="Times New Roman" w:cs="Times New Roman"/>
-                <w:sz w:val="28"/>
-                <w:szCs w:val="28"/>
-                <w:vertAlign w:val="superscript"/>
-                <w:lang w:eastAsia="ru-RU"/>
-              </w:rPr>
-              <w:t>специальности</w:t>
-            </w:r>
-            <w:proofErr w:type="spellEnd"/>
-            <w:r>
-              <w:rPr>
-                <w:rFonts w:ascii="Times New Roman" w:hAnsi="Times New Roman" w:cs="Times New Roman"/>
-                <w:sz w:val="28"/>
-                <w:szCs w:val="28"/>
-                <w:vertAlign w:val="superscript"/>
-                <w:lang w:eastAsia="ru-RU"/>
-              </w:rPr>
-              <w:t xml:space="preserve">,  </w:t>
-            </w:r>
-            <w:proofErr w:type="spellStart"/>
-            <w:r>
-              <w:rPr>
-                <w:rFonts w:ascii="Times New Roman" w:hAnsi="Times New Roman" w:cs="Times New Roman"/>
-                <w:sz w:val="28"/>
-                <w:szCs w:val="28"/>
-                <w:vertAlign w:val="superscript"/>
-                <w:lang w:eastAsia="ru-RU"/>
-              </w:rPr>
-              <w:t>группа</w:t>
-            </w:r>
-            <w:proofErr w:type="spellEnd"/>
-            <w:proofErr w:type="gramEnd"/>
+              <w:t>индекс и наименование специальности,  группа</w:t>
+            </w:r>
           </w:p>
           <w:p>
             <w:pPr>
@@ -327,25 +266,14 @@
                 <w:lang w:eastAsia="ru-RU"/>
               </w:rPr>
             </w:pPr>
-            <w:proofErr w:type="spellStart"/>
-            <w:r>
-              <w:rPr>
-                <w:rFonts w:ascii="Times New Roman" w:hAnsi="Times New Roman" w:cs="Times New Roman"/>
-                <w:sz w:val="28"/>
-                <w:szCs w:val="28"/>
-                <w:lang w:eastAsia="ru-RU"/>
-              </w:rPr>
-              <w:t>Председатель</w:t>
-            </w:r>
-            <w:proofErr w:type="spellEnd"/>
-            <w:r>
-              <w:rPr>
-                <w:rFonts w:ascii="Times New Roman" w:hAnsi="Times New Roman" w:cs="Times New Roman"/>
-                <w:sz w:val="28"/>
-                <w:szCs w:val="28"/>
-                <w:lang w:eastAsia="ru-RU"/>
-              </w:rPr>
-              <w:t xml:space="preserve"> ЦМК </w:t>
+            <w:r>
+              <w:rPr>
+                <w:rFonts w:ascii="Times New Roman" w:hAnsi="Times New Roman" w:cs="Times New Roman"/>
+                <w:sz w:val="28"/>
+                <w:szCs w:val="28"/>
+                <w:lang w:eastAsia="ru-RU"/>
+              </w:rPr>
+              <w:t xml:space="preserve">Председатель ЦМК </w:t>
             </w:r>
           </w:p>
         </w:tc>
@@ -382,45 +310,14 @@
                 <w:lang w:eastAsia="ru-RU"/>
               </w:rPr>
             </w:pPr>
-            <w:proofErr w:type="spellStart"/>
-            <w:r>
-              <w:rPr>
-                <w:rFonts w:ascii="Times New Roman" w:hAnsi="Times New Roman" w:cs="Times New Roman"/>
-                <w:sz w:val="28"/>
-                <w:szCs w:val="28"/>
-                <w:lang w:eastAsia="ru-RU"/>
-              </w:rPr>
-              <w:t>Заведующий</w:t>
-            </w:r>
-            <w:proofErr w:type="spellEnd"/>
-            <w:r>
-              <w:rPr>
-                <w:rFonts w:ascii="Times New Roman" w:hAnsi="Times New Roman" w:cs="Times New Roman"/>
-                <w:sz w:val="28"/>
-                <w:szCs w:val="28"/>
-                <w:lang w:eastAsia="ru-RU"/>
-              </w:rPr>
-              <w:t xml:space="preserve"> </w:t>
-            </w:r>
-            <w:proofErr w:type="spellStart"/>
-            <w:r>
-              <w:rPr>
-                <w:rFonts w:ascii="Times New Roman" w:hAnsi="Times New Roman" w:cs="Times New Roman"/>
-                <w:sz w:val="28"/>
-                <w:szCs w:val="28"/>
-                <w:lang w:eastAsia="ru-RU"/>
-              </w:rPr>
-              <w:t>отделением</w:t>
-            </w:r>
-            <w:proofErr w:type="spellEnd"/>
-            <w:r>
-              <w:rPr>
-                <w:rFonts w:ascii="Times New Roman" w:hAnsi="Times New Roman" w:cs="Times New Roman"/>
-                <w:sz w:val="28"/>
-                <w:szCs w:val="28"/>
-                <w:lang w:eastAsia="ru-RU"/>
-              </w:rPr>
-              <w:t xml:space="preserve"> </w:t>
+            <w:r>
+              <w:rPr>
+                <w:rFonts w:ascii="Times New Roman" w:hAnsi="Times New Roman" w:cs="Times New Roman"/>
+                <w:sz w:val="28"/>
+                <w:szCs w:val="28"/>
+                <w:lang w:eastAsia="ru-RU"/>
+              </w:rPr>
+              <w:t xml:space="preserve">Заведующий отделением </w:t>
             </w:r>
           </w:p>
         </w:tc>
@@ -557,7 +454,6 @@
                 <w:lang w:eastAsia="ru-RU"/>
               </w:rPr>
             </w:pPr>
-            <w:proofErr w:type="spellStart"/>
             <w:r>
               <w:rPr>
                 <w:rFonts w:ascii="Times New Roman" w:hAnsi="Times New Roman" w:cs="Times New Roman"/>
@@ -566,31 +462,8 @@
                 <w:vertAlign w:val="superscript"/>
                 <w:lang w:eastAsia="ru-RU"/>
               </w:rPr>
-              <w:t>подпись</w:t>
-            </w:r>
-            <w:proofErr w:type="spellEnd"/>
-            <w:r>
-              <w:rPr>
-                <w:rFonts w:ascii="Times New Roman" w:hAnsi="Times New Roman" w:cs="Times New Roman"/>
-                <w:sz w:val="28"/>
-                <w:szCs w:val="28"/>
-                <w:vertAlign w:val="superscript"/>
-                <w:lang w:eastAsia="ru-RU"/>
-              </w:rPr>
-              <w:t xml:space="preserve">, </w:t>
-            </w:r>
-            <w:proofErr w:type="spellStart"/>
-            <w:r>
-              <w:rPr>
-                <w:rFonts w:ascii="Times New Roman" w:hAnsi="Times New Roman" w:cs="Times New Roman"/>
-                <w:sz w:val="28"/>
-                <w:szCs w:val="28"/>
-                <w:vertAlign w:val="superscript"/>
-                <w:lang w:eastAsia="ru-RU"/>
-              </w:rPr>
-              <w:t>расшифровка</w:t>
-            </w:r>
-            <w:proofErr w:type="spellEnd"/>
+              <w:t>подпись, расшифровка</w:t>
+            </w:r>
           </w:p>
         </w:tc>
         <w:tc>
@@ -664,7 +537,6 @@
                 <w:lang w:eastAsia="ru-RU"/>
               </w:rPr>
             </w:pPr>
-            <w:proofErr w:type="spellStart"/>
             <w:r>
               <w:rPr>
                 <w:rFonts w:ascii="Times New Roman" w:hAnsi="Times New Roman" w:cs="Times New Roman"/>
@@ -673,31 +545,8 @@
                 <w:vertAlign w:val="superscript"/>
                 <w:lang w:eastAsia="ru-RU"/>
               </w:rPr>
-              <w:t>подпись</w:t>
-            </w:r>
-            <w:proofErr w:type="spellEnd"/>
-            <w:r>
-              <w:rPr>
-                <w:rFonts w:ascii="Times New Roman" w:hAnsi="Times New Roman" w:cs="Times New Roman"/>
-                <w:sz w:val="28"/>
-                <w:szCs w:val="28"/>
-                <w:vertAlign w:val="superscript"/>
-                <w:lang w:eastAsia="ru-RU"/>
-              </w:rPr>
-              <w:t xml:space="preserve">, </w:t>
-            </w:r>
-            <w:proofErr w:type="spellStart"/>
-            <w:r>
-              <w:rPr>
-                <w:rFonts w:ascii="Times New Roman" w:hAnsi="Times New Roman" w:cs="Times New Roman"/>
-                <w:sz w:val="28"/>
-                <w:szCs w:val="28"/>
-                <w:vertAlign w:val="superscript"/>
-                <w:lang w:eastAsia="ru-RU"/>
-              </w:rPr>
-              <w:t>расшифровка</w:t>
-            </w:r>
-            <w:proofErr w:type="spellEnd"/>
+              <w:t>подпись, расшифровка</w:t>
+            </w:r>
           </w:p>
         </w:tc>
       </w:tr>
@@ -995,7 +844,6 @@
                 <w:lang w:eastAsia="ru-RU"/>
               </w:rPr>
             </w:pPr>
-            <w:proofErr w:type="spellStart"/>
             <w:r>
               <w:rPr>
                 <w:rFonts w:ascii="Times New Roman" w:hAnsi="Times New Roman" w:cs="Times New Roman"/>
@@ -1006,7 +854,6 @@
               </w:rPr>
               <w:t>дата</w:t>
             </w:r>
-            <w:proofErr w:type="spellEnd"/>
           </w:p>
         </w:tc>
         <w:tc>
@@ -1080,7 +927,6 @@
                 <w:lang w:eastAsia="ru-RU"/>
               </w:rPr>
             </w:pPr>
-            <w:proofErr w:type="spellStart"/>
             <w:r>
               <w:rPr>
                 <w:rFonts w:ascii="Times New Roman" w:hAnsi="Times New Roman" w:cs="Times New Roman"/>
@@ -1091,7 +937,6 @@
               </w:rPr>
               <w:t>дата</w:t>
             </w:r>
-            <w:proofErr w:type="spellEnd"/>
           </w:p>
         </w:tc>
       </w:tr>
@@ -1193,51 +1038,7 @@
                 <w:szCs w:val="28"/>
                 <w:lang w:eastAsia="ru-RU"/>
               </w:rPr>
-              <w:t>(</w:t>
-            </w:r>
-            <w:proofErr w:type="spellStart"/>
-            <w:r>
-              <w:rPr>
-                <w:rFonts w:ascii="Times New Roman" w:hAnsi="Times New Roman" w:cs="Times New Roman"/>
-                <w:bCs/>
-                <w:sz w:val="28"/>
-                <w:szCs w:val="28"/>
-                <w:lang w:eastAsia="ru-RU"/>
-              </w:rPr>
-              <w:t>дипломному</w:t>
-            </w:r>
-            <w:proofErr w:type="spellEnd"/>
-            <w:r>
-              <w:rPr>
-                <w:rFonts w:ascii="Times New Roman" w:hAnsi="Times New Roman" w:cs="Times New Roman"/>
-                <w:bCs/>
-                <w:sz w:val="28"/>
-                <w:szCs w:val="28"/>
-                <w:lang w:eastAsia="ru-RU"/>
-              </w:rPr>
-              <w:t xml:space="preserve"> </w:t>
-            </w:r>
-            <w:proofErr w:type="spellStart"/>
-            <w:r>
-              <w:rPr>
-                <w:rFonts w:ascii="Times New Roman" w:hAnsi="Times New Roman" w:cs="Times New Roman"/>
-                <w:bCs/>
-                <w:sz w:val="28"/>
-                <w:szCs w:val="28"/>
-                <w:lang w:eastAsia="ru-RU"/>
-              </w:rPr>
-              <w:t>проекту</w:t>
-            </w:r>
-            <w:proofErr w:type="spellEnd"/>
-            <w:r>
-              <w:rPr>
-                <w:rFonts w:ascii="Times New Roman" w:hAnsi="Times New Roman" w:cs="Times New Roman"/>
-                <w:bCs/>
-                <w:sz w:val="28"/>
-                <w:szCs w:val="28"/>
-                <w:lang w:eastAsia="ru-RU"/>
-              </w:rPr>
-              <w:t>)</w:t>
+              <w:t>(дипломному проекту)</w:t>
             </w:r>
           </w:p>
           <w:p>
@@ -1301,6 +1102,36 @@
               </w:rPr>
               <w:t>и</w:t>
             </w:r>
+            <w:r>
+              <w:rPr>
+                <w:rFonts w:ascii="Times New Roman" w:hAnsi="Times New Roman" w:cs="Times New Roman"/>
+                <w:b/>
+                <w:sz w:val="28"/>
+                <w:szCs w:val="28"/>
+                <w:lang w:val="ru-RU" w:eastAsia="ru-RU"/>
+              </w:rPr>
+              <w:t xml:space="preserve"> ООО «Ремон Девело</w:t>
+            </w:r>
+            <w:r>
+              <w:rPr>
+                <w:rFonts w:ascii="Times New Roman" w:hAnsi="Times New Roman" w:cs="Times New Roman"/>
+                <w:b/>
+                <w:sz w:val="28"/>
+                <w:szCs w:val="28"/>
+                <w:lang w:val="ru-RU" w:eastAsia="ru-RU"/>
+              </w:rPr>
+              <w:t>пер</w:t>
+            </w:r>
+            <w:r>
+              <w:rPr>
+                <w:rFonts w:ascii="Times New Roman" w:hAnsi="Times New Roman" w:cs="Times New Roman"/>
+                <w:b/>
+                <w:sz w:val="28"/>
+                <w:szCs w:val="28"/>
+                <w:lang w:val="ru-RU" w:eastAsia="ru-RU"/>
+              </w:rPr>
+              <w:t>»</w:t>
+            </w:r>
           </w:p>
         </w:tc>
       </w:tr>
@@ -1334,37 +1165,11 @@
             <w:r>
               <w:rPr>
                 <w:rFonts w:ascii="Times New Roman" w:hAnsi="Times New Roman" w:cs="Times New Roman"/>
-                <w:b/>
-                <w:iCs/>
-                <w:sz w:val="28"/>
-                <w:szCs w:val="28"/>
-                <w:lang w:val="ru-RU"/>
-              </w:rPr>
-              <w:t>ООО «</w:t>
-            </w:r>
-            <w:proofErr w:type="spellStart"/>
-            <w:r>
-              <w:rPr>
-                <w:rFonts w:ascii="Times New Roman" w:hAnsi="Times New Roman" w:cs="Times New Roman"/>
-                <w:b/>
-                <w:iCs/>
-                <w:sz w:val="28"/>
-                <w:szCs w:val="28"/>
-                <w:lang w:val="ru-RU"/>
-              </w:rPr>
-              <w:t>Ремон</w:t>
-            </w:r>
-            <w:proofErr w:type="spellEnd"/>
-            <w:r>
-              <w:rPr>
-                <w:rFonts w:ascii="Times New Roman" w:hAnsi="Times New Roman" w:cs="Times New Roman"/>
-                <w:b/>
-                <w:iCs/>
-                <w:sz w:val="28"/>
-                <w:szCs w:val="28"/>
-                <w:lang w:val="ru-RU"/>
-              </w:rPr>
-              <w:t xml:space="preserve"> Девелопер»</w:t>
+                <w:sz w:val="28"/>
+                <w:szCs w:val="28"/>
+                <w:lang w:eastAsia="ru-RU"/>
+              </w:rPr>
+              <w:t>тема дипломного проекта</w:t>
             </w:r>
           </w:p>
         </w:tc>
@@ -1532,25 +1337,14 @@
                 <w:lang w:eastAsia="ru-RU"/>
               </w:rPr>
             </w:pPr>
-            <w:proofErr w:type="spellStart"/>
-            <w:r>
-              <w:rPr>
-                <w:rFonts w:ascii="Times New Roman" w:hAnsi="Times New Roman" w:cs="Times New Roman"/>
-                <w:sz w:val="28"/>
-                <w:szCs w:val="28"/>
-                <w:lang w:eastAsia="ru-RU"/>
-              </w:rPr>
-              <w:t>Дипломник</w:t>
-            </w:r>
-            <w:proofErr w:type="spellEnd"/>
-            <w:r>
-              <w:rPr>
-                <w:rFonts w:ascii="Times New Roman" w:hAnsi="Times New Roman" w:cs="Times New Roman"/>
-                <w:sz w:val="28"/>
-                <w:szCs w:val="28"/>
-                <w:lang w:eastAsia="ru-RU"/>
-              </w:rPr>
-              <w:t xml:space="preserve">: </w:t>
+            <w:r>
+              <w:rPr>
+                <w:rFonts w:ascii="Times New Roman" w:hAnsi="Times New Roman" w:cs="Times New Roman"/>
+                <w:sz w:val="28"/>
+                <w:szCs w:val="28"/>
+                <w:lang w:eastAsia="ru-RU"/>
+              </w:rPr>
+              <w:t xml:space="preserve">Дипломник: </w:t>
             </w:r>
           </w:p>
         </w:tc>
@@ -1618,45 +1412,14 @@
                 <w:lang w:eastAsia="ru-RU"/>
               </w:rPr>
             </w:pPr>
-            <w:proofErr w:type="spellStart"/>
-            <w:r>
-              <w:rPr>
-                <w:rFonts w:ascii="Times New Roman" w:hAnsi="Times New Roman" w:cs="Times New Roman"/>
-                <w:sz w:val="28"/>
-                <w:szCs w:val="28"/>
-                <w:lang w:eastAsia="ru-RU"/>
-              </w:rPr>
-              <w:t>Руководитель</w:t>
-            </w:r>
-            <w:proofErr w:type="spellEnd"/>
-            <w:r>
-              <w:rPr>
-                <w:rFonts w:ascii="Times New Roman" w:hAnsi="Times New Roman" w:cs="Times New Roman"/>
-                <w:sz w:val="28"/>
-                <w:szCs w:val="28"/>
-                <w:lang w:eastAsia="ru-RU"/>
-              </w:rPr>
-              <w:t xml:space="preserve"> </w:t>
-            </w:r>
-            <w:proofErr w:type="spellStart"/>
-            <w:r>
-              <w:rPr>
-                <w:rFonts w:ascii="Times New Roman" w:hAnsi="Times New Roman" w:cs="Times New Roman"/>
-                <w:sz w:val="28"/>
-                <w:szCs w:val="28"/>
-                <w:lang w:eastAsia="ru-RU"/>
-              </w:rPr>
-              <w:t>проекта</w:t>
-            </w:r>
-            <w:proofErr w:type="spellEnd"/>
-            <w:r>
-              <w:rPr>
-                <w:rFonts w:ascii="Times New Roman" w:hAnsi="Times New Roman" w:cs="Times New Roman"/>
-                <w:sz w:val="28"/>
-                <w:szCs w:val="28"/>
-                <w:lang w:eastAsia="ru-RU"/>
-              </w:rPr>
-              <w:t xml:space="preserve">: </w:t>
+            <w:r>
+              <w:rPr>
+                <w:rFonts w:ascii="Times New Roman" w:hAnsi="Times New Roman" w:cs="Times New Roman"/>
+                <w:sz w:val="28"/>
+                <w:szCs w:val="28"/>
+                <w:lang w:eastAsia="ru-RU"/>
+              </w:rPr>
+              <w:t xml:space="preserve">Руководитель проекта: </w:t>
             </w:r>
           </w:p>
         </w:tc>
@@ -1701,7 +1464,6 @@
                 <w:lang w:eastAsia="ru-RU"/>
               </w:rPr>
             </w:pPr>
-            <w:proofErr w:type="spellStart"/>
             <w:r>
               <w:rPr>
                 <w:rFonts w:ascii="Times New Roman" w:hAnsi="Times New Roman" w:cs="Times New Roman"/>
@@ -1710,31 +1472,8 @@
                 <w:vertAlign w:val="superscript"/>
                 <w:lang w:eastAsia="ru-RU"/>
               </w:rPr>
-              <w:t>подпись</w:t>
-            </w:r>
-            <w:proofErr w:type="spellEnd"/>
-            <w:r>
-              <w:rPr>
-                <w:rFonts w:ascii="Times New Roman" w:hAnsi="Times New Roman" w:cs="Times New Roman"/>
-                <w:sz w:val="28"/>
-                <w:szCs w:val="28"/>
-                <w:vertAlign w:val="superscript"/>
-                <w:lang w:eastAsia="ru-RU"/>
-              </w:rPr>
-              <w:t xml:space="preserve">, </w:t>
-            </w:r>
-            <w:proofErr w:type="spellStart"/>
-            <w:r>
-              <w:rPr>
-                <w:rFonts w:ascii="Times New Roman" w:hAnsi="Times New Roman" w:cs="Times New Roman"/>
-                <w:sz w:val="28"/>
-                <w:szCs w:val="28"/>
-                <w:vertAlign w:val="superscript"/>
-                <w:lang w:eastAsia="ru-RU"/>
-              </w:rPr>
-              <w:t>расшифровка</w:t>
-            </w:r>
-            <w:proofErr w:type="spellEnd"/>
+              <w:t>подпись, расшифровка</w:t>
+            </w:r>
           </w:p>
         </w:tc>
       </w:tr>
@@ -1826,7 +1565,6 @@
                 <w:lang w:eastAsia="ru-RU"/>
               </w:rPr>
             </w:pPr>
-            <w:proofErr w:type="spellStart"/>
             <w:r>
               <w:rPr>
                 <w:rFonts w:ascii="Times New Roman" w:hAnsi="Times New Roman" w:cs="Times New Roman"/>
@@ -1836,7 +1574,6 @@
               </w:rPr>
               <w:t>Консультант</w:t>
             </w:r>
-            <w:proofErr w:type="spellEnd"/>
           </w:p>
         </w:tc>
         <w:tc>
@@ -1914,7 +1651,6 @@
                 <w:lang w:eastAsia="ru-RU"/>
               </w:rPr>
             </w:pPr>
-            <w:proofErr w:type="spellStart"/>
             <w:r>
               <w:rPr>
                 <w:rFonts w:ascii="Times New Roman" w:hAnsi="Times New Roman" w:cs="Times New Roman"/>
@@ -1923,31 +1659,8 @@
                 <w:vertAlign w:val="superscript"/>
                 <w:lang w:eastAsia="ru-RU"/>
               </w:rPr>
-              <w:t>подпись</w:t>
-            </w:r>
-            <w:proofErr w:type="spellEnd"/>
-            <w:r>
-              <w:rPr>
-                <w:rFonts w:ascii="Times New Roman" w:hAnsi="Times New Roman" w:cs="Times New Roman"/>
-                <w:sz w:val="28"/>
-                <w:szCs w:val="28"/>
-                <w:vertAlign w:val="superscript"/>
-                <w:lang w:eastAsia="ru-RU"/>
-              </w:rPr>
-              <w:t xml:space="preserve">, </w:t>
-            </w:r>
-            <w:proofErr w:type="spellStart"/>
-            <w:r>
-              <w:rPr>
-                <w:rFonts w:ascii="Times New Roman" w:hAnsi="Times New Roman" w:cs="Times New Roman"/>
-                <w:sz w:val="28"/>
-                <w:szCs w:val="28"/>
-                <w:vertAlign w:val="superscript"/>
-                <w:lang w:eastAsia="ru-RU"/>
-              </w:rPr>
-              <w:t>расшифровка</w:t>
-            </w:r>
-            <w:proofErr w:type="spellEnd"/>
+              <w:t>подпись, расшифровка</w:t>
+            </w:r>
           </w:p>
         </w:tc>
       </w:tr>
@@ -2063,7 +1776,6 @@
                 <w:lang w:eastAsia="ru-RU"/>
               </w:rPr>
             </w:pPr>
-            <w:proofErr w:type="spellStart"/>
             <w:r>
               <w:rPr>
                 <w:rFonts w:ascii="Times New Roman" w:hAnsi="Times New Roman" w:cs="Times New Roman"/>
@@ -2073,7 +1785,6 @@
               </w:rPr>
               <w:t>Консультант</w:t>
             </w:r>
-            <w:proofErr w:type="spellEnd"/>
           </w:p>
         </w:tc>
         <w:tc>
@@ -2151,7 +1862,6 @@
                 <w:lang w:eastAsia="ru-RU"/>
               </w:rPr>
             </w:pPr>
-            <w:proofErr w:type="spellStart"/>
             <w:r>
               <w:rPr>
                 <w:rFonts w:ascii="Times New Roman" w:hAnsi="Times New Roman" w:cs="Times New Roman"/>
@@ -2160,31 +1870,8 @@
                 <w:vertAlign w:val="superscript"/>
                 <w:lang w:eastAsia="ru-RU"/>
               </w:rPr>
-              <w:t>подпись</w:t>
-            </w:r>
-            <w:proofErr w:type="spellEnd"/>
-            <w:r>
-              <w:rPr>
-                <w:rFonts w:ascii="Times New Roman" w:hAnsi="Times New Roman" w:cs="Times New Roman"/>
-                <w:sz w:val="28"/>
-                <w:szCs w:val="28"/>
-                <w:vertAlign w:val="superscript"/>
-                <w:lang w:eastAsia="ru-RU"/>
-              </w:rPr>
-              <w:t xml:space="preserve">, </w:t>
-            </w:r>
-            <w:proofErr w:type="spellStart"/>
-            <w:r>
-              <w:rPr>
-                <w:rFonts w:ascii="Times New Roman" w:hAnsi="Times New Roman" w:cs="Times New Roman"/>
-                <w:sz w:val="28"/>
-                <w:szCs w:val="28"/>
-                <w:vertAlign w:val="superscript"/>
-                <w:lang w:eastAsia="ru-RU"/>
-              </w:rPr>
-              <w:t>расшифровка</w:t>
-            </w:r>
-            <w:proofErr w:type="spellEnd"/>
+              <w:t>подпись, расшифровка</w:t>
+            </w:r>
           </w:p>
         </w:tc>
       </w:tr>
@@ -2312,7 +1999,6 @@
                 <w:lang w:eastAsia="ru-RU"/>
               </w:rPr>
             </w:pPr>
-            <w:proofErr w:type="spellStart"/>
             <w:r>
               <w:rPr>
                 <w:rFonts w:ascii="Times New Roman" w:hAnsi="Times New Roman" w:cs="Times New Roman"/>
@@ -2322,7 +2008,6 @@
               </w:rPr>
               <w:t>Нормоконтроль</w:t>
             </w:r>
-            <w:proofErr w:type="spellEnd"/>
           </w:p>
         </w:tc>
         <w:tc>
@@ -2366,7 +2051,6 @@
                 <w:lang w:eastAsia="ru-RU"/>
               </w:rPr>
             </w:pPr>
-            <w:proofErr w:type="spellStart"/>
             <w:r>
               <w:rPr>
                 <w:rFonts w:ascii="Times New Roman" w:hAnsi="Times New Roman" w:cs="Times New Roman"/>
@@ -2375,31 +2059,8 @@
                 <w:vertAlign w:val="superscript"/>
                 <w:lang w:eastAsia="ru-RU"/>
               </w:rPr>
-              <w:t>подпись</w:t>
-            </w:r>
-            <w:proofErr w:type="spellEnd"/>
-            <w:r>
-              <w:rPr>
-                <w:rFonts w:ascii="Times New Roman" w:hAnsi="Times New Roman" w:cs="Times New Roman"/>
-                <w:sz w:val="28"/>
-                <w:szCs w:val="28"/>
-                <w:vertAlign w:val="superscript"/>
-                <w:lang w:eastAsia="ru-RU"/>
-              </w:rPr>
-              <w:t xml:space="preserve">, </w:t>
-            </w:r>
-            <w:proofErr w:type="spellStart"/>
-            <w:r>
-              <w:rPr>
-                <w:rFonts w:ascii="Times New Roman" w:hAnsi="Times New Roman" w:cs="Times New Roman"/>
-                <w:sz w:val="28"/>
-                <w:szCs w:val="28"/>
-                <w:vertAlign w:val="superscript"/>
-                <w:lang w:eastAsia="ru-RU"/>
-              </w:rPr>
-              <w:t>расшифровка</w:t>
-            </w:r>
-            <w:proofErr w:type="spellEnd"/>
+              <w:t>подпись, расшифровка</w:t>
+            </w:r>
           </w:p>
         </w:tc>
       </w:tr>
@@ -2533,7 +2194,6 @@
                 <w:lang w:eastAsia="ru-RU"/>
               </w:rPr>
             </w:pPr>
-            <w:proofErr w:type="spellStart"/>
             <w:r>
               <w:rPr>
                 <w:rFonts w:ascii="Times New Roman" w:hAnsi="Times New Roman" w:cs="Times New Roman"/>
@@ -2542,31 +2202,8 @@
                 <w:vertAlign w:val="superscript"/>
                 <w:lang w:eastAsia="ru-RU"/>
               </w:rPr>
-              <w:t>подпись</w:t>
-            </w:r>
-            <w:proofErr w:type="spellEnd"/>
-            <w:r>
-              <w:rPr>
-                <w:rFonts w:ascii="Times New Roman" w:hAnsi="Times New Roman" w:cs="Times New Roman"/>
-                <w:sz w:val="28"/>
-                <w:szCs w:val="28"/>
-                <w:vertAlign w:val="superscript"/>
-                <w:lang w:eastAsia="ru-RU"/>
-              </w:rPr>
-              <w:t xml:space="preserve">, </w:t>
-            </w:r>
-            <w:proofErr w:type="spellStart"/>
-            <w:r>
-              <w:rPr>
-                <w:rFonts w:ascii="Times New Roman" w:hAnsi="Times New Roman" w:cs="Times New Roman"/>
-                <w:sz w:val="28"/>
-                <w:szCs w:val="28"/>
-                <w:vertAlign w:val="superscript"/>
-                <w:lang w:eastAsia="ru-RU"/>
-              </w:rPr>
-              <w:t>расшифровка</w:t>
-            </w:r>
-            <w:proofErr w:type="spellEnd"/>
+              <w:t>подпись, расшифровка</w:t>
+            </w:r>
           </w:p>
         </w:tc>
       </w:tr>

</xml_diff>